<commit_message>
Refresh about page text
</commit_message>
<xml_diff>
--- a/About.docx
+++ b/About.docx
@@ -35,7 +35,7 @@
           <w:sz w:val="24"/>
           <w:sz-cs w:val="24"/>
         </w:rPr>
-        <w:t xml:space="preserve">Hello, friends. I’m glad you are reading this. I have done so much research to bring me to this page. I am sad to say that nearly 100% of bird threats involve human activity. Agriculture alone puts 74% of the bird species in the entire world at risk of extinction. So I want to emphasize something many people don’t understand, and I want you to be here to hear it: It isn’t fair how birds are treated. I realize that many people think of birds as just an animal, and animals seem to be invisible to human activity. It’s like we don’t care that we harm the animals. So many people don’t know how bad this is to our environment and ecosystem. But I believe it is important to value every living being as a true living being. I did focus this book on birds, but they aren’t the only ones suffering. I hope you join me in saving wildlife, for many of these natural wonders were here long before we were. They respect us. Why don’t we respect them? Well, we can. But we don’t.</w:t>
+        <w:t xml:space="preserve">Hello, friends. I’m glad you are reading this. I have done so much research to bring me to this page. I am sad to say that nearly 100% of bird threats involve human activity. Agriculture alone puts 74% of the bird species in the entire world at risk of extinction. So I want to emphasize something many people don’t understand, and I want you to be here to hear it: It isn’t fair how birds are treated. I realize that many people think of birds as just an animal, and animals seem to be invisible to human activity. It’s like we don’t care that we harm the animals. So many people don’t know how bad this is to our environment and ecosystem. But I believe it is important to value every living being as a true living being. I did focus this website on birds, but they aren’t the only ones suffering. I hope you join me in saving wildlife, for many of these natural wonders were here long before we were. They respect us. Why don’t we respect them? Well, we can. But we don’t.</w:t>
       </w:r>
     </w:p>
     <w:p>
@@ -81,7 +81,7 @@
         </w:rPr>
         <w:t xml:space="preserve"/>
         <w:tab/>
-        <w:t xml:space="preserve">I started loving birds when I began writing this book, which is why I chose this as the topic. A bit after that, my mom bought me a hummingbird feeder and we hung it right outside the kitchen. It became a regular thing for Broad-Tailed Hummingbirds and Anna’s Hummingbirds to visit everyday. We also planted flowers that attracted these little hummingbirds. If you are interested, you can get a feeder, or maybe some flowers (red stands out to hummingbirds). Make sure feeders have fresh sugar water so that the hummingbirds will drink it. Sugar water is simple to make: just boil a pot of water and stir in sugar. Your yard can be a safe habitat for hummingbirds if pesticides aren’t used and there isn’t too much glass. There should also be shrubbery and trees for shelter and for the place to look and feel more like their natural habitats. I know at least one hummingbird has been happy living near my backyard.</w:t>
+        <w:t xml:space="preserve">My bird love started when my art teacher assigned me to join a bird competition. I joined the contest tqo years in a row. The two birds used in the contests were western bluebird and american avocet. Through teh research I did and the drawing I took time on, I continued to understand birds. I began loving birds of every specie. They were my obbession from them on. A bit after that, my mom bought me a hummingbird feeder and we hung it right outside the kitchen. It became a regular thing for Broad-Tailed Hummingbirds and Anna’s Hummingbirds to visit everyday. We also planted flowers that attracted these little hummingbirds. If you are interested, you can get a feeder, or maybe some flowers (red stands out to hummingbirds). Make sure feeders have fresh sugar water so that the hummingbirds will drink it. Sugar water is simple to make: just boil a pot of water and stir in sugar. Your yard can be a safe habitat for hummingbirds if pesticides aren’t used and there isn’t too much glass. There should also be shrubbery and trees for shelter and for the place to look and feel more like their natural habitats. I know at least one hummingbird has been happy living near my backyard.</w:t>
       </w:r>
     </w:p>
     <w:p>

</xml_diff>

<commit_message>
Proofread bird and about text
</commit_message>
<xml_diff>
--- a/About.docx
+++ b/About.docx
@@ -81,7 +81,7 @@
         </w:rPr>
         <w:t xml:space="preserve"/>
         <w:tab/>
-        <w:t xml:space="preserve">My bird love started when my art teacher assigned me to join a bird competition. I joined the contest tqo years in a row. The two birds used in the contests were western bluebird and american avocet. Through teh research I did and the drawing I took time on, I continued to understand birds. I began loving birds of every specie. They were my obbession from them on. A bit after that, my mom bought me a hummingbird feeder and we hung it right outside the kitchen. It became a regular thing for Broad-Tailed Hummingbirds and Anna’s Hummingbirds to visit everyday. We also planted flowers that attracted these little hummingbirds. If you are interested, you can get a feeder, or maybe some flowers (red stands out to hummingbirds). Make sure feeders have fresh sugar water so that the hummingbirds will drink it. Sugar water is simple to make: just boil a pot of water and stir in sugar. Your yard can be a safe habitat for hummingbirds if pesticides aren’t used and there isn’t too much glass. There should also be shrubbery and trees for shelter and for the place to look and feel more like their natural habitats. I know at least one hummingbird has been happy living near my backyard.</w:t>
+        <w:t xml:space="preserve">My bird love started when my art teacher assigned me to join a bird competition. I joined the contest two years in a row. The two birds used in the contests were Western Bluebird and American Avocet. Through the research I did and the drawing I took time on, I continued to understand birds. I began loving birds of every species. They were my obsession from then on. A bit after that, my mom bought me a hummingbird feeder and we hung it right outside the kitchen. It became a regular thing for Broad-Tailed Hummingbirds and Anna’s Hummingbirds to visit every day. We also planted flowers that attracted these little hummingbirds. If you are interested, you can get a feeder, or maybe some flowers (red stands out to hummingbirds). Make sure feeders have fresh sugar water so that the hummingbirds will drink it. Sugar water is simple to make: just boil a pot of water and stir in sugar. Your yard can be a safe habitat for hummingbirds if pesticides aren’t used and there isn’t too much glass. There should also be shrubbery and trees for shelter and for the place to look and feel more like their natural habitats. I know at least one hummingbird has been happy living near my backyard.</w:t>
       </w:r>
     </w:p>
     <w:p>
@@ -151,7 +151,7 @@
           <w:sz w:val="24"/>
           <w:sz-cs w:val="24"/>
         </w:rPr>
-        <w:t xml:space="preserve">Even though none were written about in these chapters, endangered birds still exist everywhere. Around 90 are found in only the USA! Ones in the Bay Area include the California Chapper Rail, the California Least Tern, the Western Snowy Plover, the Marbled Murrlet, and the Burrowing Owl. We can also see that preservation in action is helpful. As written in the chapter about them, Peregrine Falcons used to be endangered, but thanks to conservation efforts, they have bounced back. </w:t>
+        <w:t xml:space="preserve">Even though none were written about in these chapters, endangered birds still exist everywhere. Around 90 are found in only the USA! Ones in the Bay Area include the California Clapper Rail, the California Least Tern, the Western Snowy Plover, the Marbled Murrelet, and the Burrowing Owl. We can also see that preservation in action is helpful. As written in the chapter about them, Peregrine Falcons used to be endangered, but thanks to conservation efforts, they have bounced back. </w:t>
       </w:r>
     </w:p>
     <w:p>

</xml_diff>